<commit_message>
docs: replace ERD with database data dictionary
</commit_message>
<xml_diff>
--- a/docs/BikeShop_Project_Overview.docx
+++ b/docs/BikeShop_Project_Overview.docx
@@ -3907,7 +3907,12 @@
         <w:pStyle w:val="Heading1"/>
       </w:pPr>
       <w:r>
-        <w:t>5 Thiết kế database</w:t>
+        <w:t>5 Thiết kế database và data dictionary</w:t>
+      </w:r>
+    </w:p>
+    <w:p>
+      <w:r>
+        <w:t>Tất cả khóa chính kiểu int hoặc bigint của bảng nghiệp vụ được SQL Server sinh tự động bằng IDENTITY(1,1). Riêng AspNetUsers.Id và AspNetRoles.Id là nvarchar(450) vì ASP.NET Core Identity dùng khóa chuỗi; ứng dụng không yêu cầu người dùng tự nhập các giá trị này.</w:t>
       </w:r>
     </w:p>
     <w:tbl>
@@ -3919,8 +3924,9 @@
         <w:tblLook w:firstColumn="1" w:firstRow="1" w:lastColumn="0" w:lastRow="0" w:noHBand="0" w:noVBand="1" w:val="04A0"/>
       </w:tblPr>
       <w:tblGrid>
-        <w:gridCol w:w="4986"/>
-        <w:gridCol w:w="4986"/>
+        <w:gridCol w:w="3324"/>
+        <w:gridCol w:w="3324"/>
+        <w:gridCol w:w="3324"/>
       </w:tblGrid>
       <w:tr>
         <w:trPr>
@@ -3928,7 +3934,7 @@
         </w:trPr>
         <w:tc>
           <w:tcPr>
-            <w:tcW w:type="dxa" w:w="2948"/>
+            <w:tcW w:type="dxa" w:w="1814"/>
             <w:shd w:fill="1F4E78"/>
             <w:vAlign w:val="center"/>
             <w:tcMar>
@@ -3951,7 +3957,7 @@
         </w:tc>
         <w:tc>
           <w:tcPr>
-            <w:tcW w:type="dxa" w:w="6350"/>
+            <w:tcW w:type="dxa" w:w="4535"/>
             <w:shd w:fill="1F4E78"/>
             <w:vAlign w:val="center"/>
             <w:tcMar>
@@ -3968,7 +3974,30 @@
                 <w:color w:val="FFFFFF"/>
                 <w:sz w:val="18"/>
               </w:rPr>
-              <w:t>Trách nhiệm</w:t>
+              <w:t>Cột và kiểu dữ liệu</w:t>
+            </w:r>
+          </w:p>
+        </w:tc>
+        <w:tc>
+          <w:tcPr>
+            <w:tcW w:type="dxa" w:w="2948"/>
+            <w:shd w:fill="1F4E78"/>
+            <w:vAlign w:val="center"/>
+            <w:tcMar>
+              <w:top w:w="100" w:type="dxa"/>
+              <w:start w:w="120" w:type="dxa"/>
+              <w:bottom w:w="100" w:type="dxa"/>
+              <w:end w:w="120" w:type="dxa"/>
+            </w:tcMar>
+          </w:tcPr>
+          <w:p>
+            <w:r>
+              <w:rPr>
+                <w:b/>
+                <w:color w:val="FFFFFF"/>
+                <w:sz w:val="18"/>
+              </w:rPr>
+              <w:t>Mục đích và ràng buộc</w:t>
             </w:r>
           </w:p>
         </w:tc>
@@ -3976,7 +4005,7 @@
       <w:tr>
         <w:tc>
           <w:tcPr>
-            <w:tcW w:type="dxa" w:w="2948"/>
+            <w:tcW w:type="dxa" w:w="1814"/>
             <w:vAlign w:val="center"/>
             <w:tcMar>
               <w:top w:w="100" w:type="dxa"/>
@@ -3999,7 +4028,38 @@
         </w:tc>
         <w:tc>
           <w:tcPr>
-            <w:tcW w:type="dxa" w:w="6350"/>
+            <w:tcW w:type="dxa" w:w="4535"/>
+            <w:vAlign w:val="center"/>
+            <w:tcMar>
+              <w:top w:w="100" w:type="dxa"/>
+              <w:start w:w="120" w:type="dxa"/>
+              <w:bottom w:w="100" w:type="dxa"/>
+              <w:end w:w="120" w:type="dxa"/>
+            </w:tcMar>
+          </w:tcPr>
+          <w:p>
+            <w:pPr>
+              <w:spacing w:after="0"/>
+            </w:pPr>
+            <w:r>
+              <w:rPr>
+                <w:sz w:val="17"/>
+              </w:rPr>
+              <w:t>Id int IDENTITY PK</w:t>
+              <w:br/>
+              <w:t>Name nvarchar(100)</w:t>
+              <w:br/>
+              <w:t>Slug varchar(120) UQ</w:t>
+              <w:br/>
+              <w:t>Description nvarchar(500) NULL</w:t>
+              <w:br/>
+              <w:t>IsActive bit</w:t>
+            </w:r>
+          </w:p>
+        </w:tc>
+        <w:tc>
+          <w:tcPr>
+            <w:tcW w:type="dxa" w:w="2948"/>
             <w:vAlign w:val="center"/>
             <w:tcMar>
               <w:top w:w="100" w:type="dxa"/>
@@ -4024,7 +4084,7 @@
       <w:tr>
         <w:tc>
           <w:tcPr>
-            <w:tcW w:type="dxa" w:w="2948"/>
+            <w:tcW w:type="dxa" w:w="1814"/>
             <w:shd w:fill="EAF2F8"/>
             <w:vAlign w:val="center"/>
             <w:tcMar>
@@ -4048,7 +4108,37 @@
         </w:tc>
         <w:tc>
           <w:tcPr>
-            <w:tcW w:type="dxa" w:w="6350"/>
+            <w:tcW w:type="dxa" w:w="4535"/>
+            <w:shd w:fill="EAF2F8"/>
+            <w:vAlign w:val="center"/>
+            <w:tcMar>
+              <w:top w:w="100" w:type="dxa"/>
+              <w:start w:w="120" w:type="dxa"/>
+              <w:bottom w:w="100" w:type="dxa"/>
+              <w:end w:w="120" w:type="dxa"/>
+            </w:tcMar>
+          </w:tcPr>
+          <w:p>
+            <w:pPr>
+              <w:spacing w:after="0"/>
+            </w:pPr>
+            <w:r>
+              <w:rPr>
+                <w:sz w:val="17"/>
+              </w:rPr>
+              <w:t>Id int IDENTITY PK</w:t>
+              <w:br/>
+              <w:t>Name nvarchar(100)</w:t>
+              <w:br/>
+              <w:t>Slug varchar(120) UQ</w:t>
+              <w:br/>
+              <w:t>IsActive bit</w:t>
+            </w:r>
+          </w:p>
+        </w:tc>
+        <w:tc>
+          <w:tcPr>
+            <w:tcW w:type="dxa" w:w="2948"/>
             <w:shd w:fill="EAF2F8"/>
             <w:vAlign w:val="center"/>
             <w:tcMar>
@@ -4074,7 +4164,7 @@
       <w:tr>
         <w:tc>
           <w:tcPr>
-            <w:tcW w:type="dxa" w:w="2948"/>
+            <w:tcW w:type="dxa" w:w="1814"/>
             <w:vAlign w:val="center"/>
             <w:tcMar>
               <w:top w:w="100" w:type="dxa"/>
@@ -4097,7 +4187,7 @@
         </w:tc>
         <w:tc>
           <w:tcPr>
-            <w:tcW w:type="dxa" w:w="6350"/>
+            <w:tcW w:type="dxa" w:w="4535"/>
             <w:vAlign w:val="center"/>
             <w:tcMar>
               <w:top w:w="100" w:type="dxa"/>
@@ -4114,7 +4204,44 @@
               <w:rPr>
                 <w:sz w:val="17"/>
               </w:rPr>
-              <w:t>Thông tin sản phẩm chung</w:t>
+              <w:t>Id int IDENTITY PK</w:t>
+              <w:br/>
+              <w:t>CategoryId int FK</w:t>
+              <w:br/>
+              <w:t>BrandId int FK</w:t>
+              <w:br/>
+              <w:t>Name nvarchar(200)</w:t>
+              <w:br/>
+              <w:t>Slug varchar(220) UQ</w:t>
+              <w:br/>
+              <w:t>Description nvarchar(max) NULL</w:t>
+              <w:br/>
+              <w:t>IsActive bit</w:t>
+              <w:br/>
+              <w:t>CreatedAt datetime2</w:t>
+            </w:r>
+          </w:p>
+        </w:tc>
+        <w:tc>
+          <w:tcPr>
+            <w:tcW w:type="dxa" w:w="2948"/>
+            <w:vAlign w:val="center"/>
+            <w:tcMar>
+              <w:top w:w="100" w:type="dxa"/>
+              <w:start w:w="120" w:type="dxa"/>
+              <w:bottom w:w="100" w:type="dxa"/>
+              <w:end w:w="120" w:type="dxa"/>
+            </w:tcMar>
+          </w:tcPr>
+          <w:p>
+            <w:pPr>
+              <w:spacing w:after="0"/>
+            </w:pPr>
+            <w:r>
+              <w:rPr>
+                <w:sz w:val="17"/>
+              </w:rPr>
+              <w:t>Thông tin chung; ngừng bán bằng IsActive</w:t>
             </w:r>
           </w:p>
         </w:tc>
@@ -4122,7 +4249,7 @@
       <w:tr>
         <w:tc>
           <w:tcPr>
-            <w:tcW w:type="dxa" w:w="2948"/>
+            <w:tcW w:type="dxa" w:w="1814"/>
             <w:shd w:fill="EAF2F8"/>
             <w:vAlign w:val="center"/>
             <w:tcMar>
@@ -4146,7 +4273,7 @@
         </w:tc>
         <w:tc>
           <w:tcPr>
-            <w:tcW w:type="dxa" w:w="6350"/>
+            <w:tcW w:type="dxa" w:w="4535"/>
             <w:shd w:fill="EAF2F8"/>
             <w:vAlign w:val="center"/>
             <w:tcMar>
@@ -4164,7 +4291,47 @@
               <w:rPr>
                 <w:sz w:val="17"/>
               </w:rPr>
-              <w:t>SKU, màu, kích thước, giá, tồn kho và rowversion</w:t>
+              <w:t>Id int IDENTITY PK</w:t>
+              <w:br/>
+              <w:t>ProductId int FK</w:t>
+              <w:br/>
+              <w:t>Sku varchar(50) UQ</w:t>
+              <w:br/>
+              <w:t>Color nvarchar(50) NULL</w:t>
+              <w:br/>
+              <w:t>Size nvarchar(30) NULL</w:t>
+              <w:br/>
+              <w:t>Price decimal(18,2)</w:t>
+              <w:br/>
+              <w:t>StockQuantity int</w:t>
+              <w:br/>
+              <w:t>IsActive bit</w:t>
+              <w:br/>
+              <w:t>RowVersion rowversion</w:t>
+            </w:r>
+          </w:p>
+        </w:tc>
+        <w:tc>
+          <w:tcPr>
+            <w:tcW w:type="dxa" w:w="2948"/>
+            <w:shd w:fill="EAF2F8"/>
+            <w:vAlign w:val="center"/>
+            <w:tcMar>
+              <w:top w:w="100" w:type="dxa"/>
+              <w:start w:w="120" w:type="dxa"/>
+              <w:bottom w:w="100" w:type="dxa"/>
+              <w:end w:w="120" w:type="dxa"/>
+            </w:tcMar>
+          </w:tcPr>
+          <w:p>
+            <w:pPr>
+              <w:spacing w:after="0"/>
+            </w:pPr>
+            <w:r>
+              <w:rPr>
+                <w:sz w:val="17"/>
+              </w:rPr>
+              <w:t>Đơn vị thực tế được bán và giữ tồn kho</w:t>
             </w:r>
           </w:p>
         </w:tc>
@@ -4172,7 +4339,7 @@
       <w:tr>
         <w:tc>
           <w:tcPr>
-            <w:tcW w:type="dxa" w:w="2948"/>
+            <w:tcW w:type="dxa" w:w="1814"/>
             <w:vAlign w:val="center"/>
             <w:tcMar>
               <w:top w:w="100" w:type="dxa"/>
@@ -4195,7 +4362,7 @@
         </w:tc>
         <w:tc>
           <w:tcPr>
-            <w:tcW w:type="dxa" w:w="6350"/>
+            <w:tcW w:type="dxa" w:w="4535"/>
             <w:vAlign w:val="center"/>
             <w:tcMar>
               <w:top w:w="100" w:type="dxa"/>
@@ -4212,7 +4379,38 @@
               <w:rPr>
                 <w:sz w:val="17"/>
               </w:rPr>
-              <w:t>Nhiều hình ảnh cho sản phẩm</w:t>
+              <w:t>Id int IDENTITY PK</w:t>
+              <w:br/>
+              <w:t>ProductId int FK</w:t>
+              <w:br/>
+              <w:t>ImageUrl nvarchar(500)</w:t>
+              <w:br/>
+              <w:t>AltText nvarchar(200) NULL</w:t>
+              <w:br/>
+              <w:t>SortOrder int</w:t>
+            </w:r>
+          </w:p>
+        </w:tc>
+        <w:tc>
+          <w:tcPr>
+            <w:tcW w:type="dxa" w:w="2948"/>
+            <w:vAlign w:val="center"/>
+            <w:tcMar>
+              <w:top w:w="100" w:type="dxa"/>
+              <w:start w:w="120" w:type="dxa"/>
+              <w:bottom w:w="100" w:type="dxa"/>
+              <w:end w:w="120" w:type="dxa"/>
+            </w:tcMar>
+          </w:tcPr>
+          <w:p>
+            <w:pPr>
+              <w:spacing w:after="0"/>
+            </w:pPr>
+            <w:r>
+              <w:rPr>
+                <w:sz w:val="17"/>
+              </w:rPr>
+              <w:t>Nhiều ảnh cho một sản phẩm</w:t>
             </w:r>
           </w:p>
         </w:tc>
@@ -4220,7 +4418,7 @@
       <w:tr>
         <w:tc>
           <w:tcPr>
-            <w:tcW w:type="dxa" w:w="2948"/>
+            <w:tcW w:type="dxa" w:w="1814"/>
             <w:shd w:fill="EAF2F8"/>
             <w:vAlign w:val="center"/>
             <w:tcMar>
@@ -4244,7 +4442,7 @@
         </w:tc>
         <w:tc>
           <w:tcPr>
-            <w:tcW w:type="dxa" w:w="6350"/>
+            <w:tcW w:type="dxa" w:w="4535"/>
             <w:shd w:fill="EAF2F8"/>
             <w:vAlign w:val="center"/>
             <w:tcMar>
@@ -4262,7 +4460,43 @@
               <w:rPr>
                 <w:sz w:val="17"/>
               </w:rPr>
-              <w:t>Lịch sử nhập, trừ và hoàn kho</w:t>
+              <w:t>Id bigint IDENTITY PK</w:t>
+              <w:br/>
+              <w:t>ProductVariantId int FK</w:t>
+              <w:br/>
+              <w:t>QuantityChange int</w:t>
+              <w:br/>
+              <w:t>Reason nvarchar(100)</w:t>
+              <w:br/>
+              <w:t>ReferenceCode nvarchar(50) NULL</w:t>
+              <w:br/>
+              <w:t>CreatedByUserId nvarchar(450) FK NULL</w:t>
+              <w:br/>
+              <w:t>CreatedAt datetime2</w:t>
+            </w:r>
+          </w:p>
+        </w:tc>
+        <w:tc>
+          <w:tcPr>
+            <w:tcW w:type="dxa" w:w="2948"/>
+            <w:shd w:fill="EAF2F8"/>
+            <w:vAlign w:val="center"/>
+            <w:tcMar>
+              <w:top w:w="100" w:type="dxa"/>
+              <w:start w:w="120" w:type="dxa"/>
+              <w:bottom w:w="100" w:type="dxa"/>
+              <w:end w:w="120" w:type="dxa"/>
+            </w:tcMar>
+          </w:tcPr>
+          <w:p>
+            <w:pPr>
+              <w:spacing w:after="0"/>
+            </w:pPr>
+            <w:r>
+              <w:rPr>
+                <w:sz w:val="17"/>
+              </w:rPr>
+              <w:t>Audit nhập, trừ và hoàn kho</w:t>
             </w:r>
           </w:p>
         </w:tc>
@@ -4270,7 +4504,7 @@
       <w:tr>
         <w:tc>
           <w:tcPr>
-            <w:tcW w:type="dxa" w:w="2948"/>
+            <w:tcW w:type="dxa" w:w="1814"/>
             <w:vAlign w:val="center"/>
             <w:tcMar>
               <w:top w:w="100" w:type="dxa"/>
@@ -4293,7 +4527,7 @@
         </w:tc>
         <w:tc>
           <w:tcPr>
-            <w:tcW w:type="dxa" w:w="6350"/>
+            <w:tcW w:type="dxa" w:w="4535"/>
             <w:vAlign w:val="center"/>
             <w:tcMar>
               <w:top w:w="100" w:type="dxa"/>
@@ -4310,7 +4544,46 @@
               <w:rPr>
                 <w:sz w:val="17"/>
               </w:rPr>
-              <w:t>Địa chỉ của khách hàng</w:t>
+              <w:t>Id int IDENTITY PK</w:t>
+              <w:br/>
+              <w:t>UserId nvarchar(450) FK</w:t>
+              <w:br/>
+              <w:t>RecipientName nvarchar(120)</w:t>
+              <w:br/>
+              <w:t>PhoneNumber varchar(20)</w:t>
+              <w:br/>
+              <w:t>AddressLine nvarchar(250)</w:t>
+              <w:br/>
+              <w:t>Ward nvarchar(100)</w:t>
+              <w:br/>
+              <w:t>District nvarchar(100)</w:t>
+              <w:br/>
+              <w:t>Province nvarchar(100)</w:t>
+              <w:br/>
+              <w:t>IsDefault bit</w:t>
+            </w:r>
+          </w:p>
+        </w:tc>
+        <w:tc>
+          <w:tcPr>
+            <w:tcW w:type="dxa" w:w="2948"/>
+            <w:vAlign w:val="center"/>
+            <w:tcMar>
+              <w:top w:w="100" w:type="dxa"/>
+              <w:start w:w="120" w:type="dxa"/>
+              <w:bottom w:w="100" w:type="dxa"/>
+              <w:end w:w="120" w:type="dxa"/>
+            </w:tcMar>
+          </w:tcPr>
+          <w:p>
+            <w:pPr>
+              <w:spacing w:after="0"/>
+            </w:pPr>
+            <w:r>
+              <w:rPr>
+                <w:sz w:val="17"/>
+              </w:rPr>
+              <w:t>Địa chỉ lưu của khách hàng</w:t>
             </w:r>
           </w:p>
         </w:tc>
@@ -4318,7 +4591,7 @@
       <w:tr>
         <w:tc>
           <w:tcPr>
-            <w:tcW w:type="dxa" w:w="2948"/>
+            <w:tcW w:type="dxa" w:w="1814"/>
             <w:shd w:fill="EAF2F8"/>
             <w:vAlign w:val="center"/>
             <w:tcMar>
@@ -4342,7 +4615,35 @@
         </w:tc>
         <w:tc>
           <w:tcPr>
-            <w:tcW w:type="dxa" w:w="6350"/>
+            <w:tcW w:type="dxa" w:w="4535"/>
+            <w:shd w:fill="EAF2F8"/>
+            <w:vAlign w:val="center"/>
+            <w:tcMar>
+              <w:top w:w="100" w:type="dxa"/>
+              <w:start w:w="120" w:type="dxa"/>
+              <w:bottom w:w="100" w:type="dxa"/>
+              <w:end w:w="120" w:type="dxa"/>
+            </w:tcMar>
+          </w:tcPr>
+          <w:p>
+            <w:pPr>
+              <w:spacing w:after="0"/>
+            </w:pPr>
+            <w:r>
+              <w:rPr>
+                <w:sz w:val="17"/>
+              </w:rPr>
+              <w:t>Id int IDENTITY PK</w:t>
+              <w:br/>
+              <w:t>UserId nvarchar(450) FK UQ</w:t>
+              <w:br/>
+              <w:t>UpdatedAt datetime2</w:t>
+            </w:r>
+          </w:p>
+        </w:tc>
+        <w:tc>
+          <w:tcPr>
+            <w:tcW w:type="dxa" w:w="2948"/>
             <w:shd w:fill="EAF2F8"/>
             <w:vAlign w:val="center"/>
             <w:tcMar>
@@ -4368,7 +4669,7 @@
       <w:tr>
         <w:tc>
           <w:tcPr>
-            <w:tcW w:type="dxa" w:w="2948"/>
+            <w:tcW w:type="dxa" w:w="1814"/>
             <w:vAlign w:val="center"/>
             <w:tcMar>
               <w:top w:w="100" w:type="dxa"/>
@@ -4391,7 +4692,7 @@
         </w:tc>
         <w:tc>
           <w:tcPr>
-            <w:tcW w:type="dxa" w:w="6350"/>
+            <w:tcW w:type="dxa" w:w="4535"/>
             <w:vAlign w:val="center"/>
             <w:tcMar>
               <w:top w:w="100" w:type="dxa"/>
@@ -4408,7 +4709,36 @@
               <w:rPr>
                 <w:sz w:val="17"/>
               </w:rPr>
-              <w:t>Biến thể và số lượng trong giỏ</w:t>
+              <w:t>Id int IDENTITY PK</w:t>
+              <w:br/>
+              <w:t>CartId int FK</w:t>
+              <w:br/>
+              <w:t>ProductVariantId int FK</w:t>
+              <w:br/>
+              <w:t>Quantity int</w:t>
+            </w:r>
+          </w:p>
+        </w:tc>
+        <w:tc>
+          <w:tcPr>
+            <w:tcW w:type="dxa" w:w="2948"/>
+            <w:vAlign w:val="center"/>
+            <w:tcMar>
+              <w:top w:w="100" w:type="dxa"/>
+              <w:start w:w="120" w:type="dxa"/>
+              <w:bottom w:w="100" w:type="dxa"/>
+              <w:end w:w="120" w:type="dxa"/>
+            </w:tcMar>
+          </w:tcPr>
+          <w:p>
+            <w:pPr>
+              <w:spacing w:after="0"/>
+            </w:pPr>
+            <w:r>
+              <w:rPr>
+                <w:sz w:val="17"/>
+              </w:rPr>
+              <w:t>UQ CartId + ProductVariantId; Quantity &gt; 0</w:t>
             </w:r>
           </w:p>
         </w:tc>
@@ -4416,7 +4746,7 @@
       <w:tr>
         <w:tc>
           <w:tcPr>
-            <w:tcW w:type="dxa" w:w="2948"/>
+            <w:tcW w:type="dxa" w:w="1814"/>
             <w:shd w:fill="EAF2F8"/>
             <w:vAlign w:val="center"/>
             <w:tcMar>
@@ -4440,7 +4770,53 @@
         </w:tc>
         <w:tc>
           <w:tcPr>
-            <w:tcW w:type="dxa" w:w="6350"/>
+            <w:tcW w:type="dxa" w:w="4535"/>
+            <w:shd w:fill="EAF2F8"/>
+            <w:vAlign w:val="center"/>
+            <w:tcMar>
+              <w:top w:w="100" w:type="dxa"/>
+              <w:start w:w="120" w:type="dxa"/>
+              <w:bottom w:w="100" w:type="dxa"/>
+              <w:end w:w="120" w:type="dxa"/>
+            </w:tcMar>
+          </w:tcPr>
+          <w:p>
+            <w:pPr>
+              <w:spacing w:after="0"/>
+            </w:pPr>
+            <w:r>
+              <w:rPr>
+                <w:sz w:val="17"/>
+              </w:rPr>
+              <w:t>Id bigint IDENTITY PK</w:t>
+              <w:br/>
+              <w:t>OrderCode varchar(30) UQ</w:t>
+              <w:br/>
+              <w:t>UserId nvarchar(450) FK</w:t>
+              <w:br/>
+              <w:t>Status int</w:t>
+              <w:br/>
+              <w:t>RecipientName nvarchar(120)</w:t>
+              <w:br/>
+              <w:t>PhoneNumber varchar(20)</w:t>
+              <w:br/>
+              <w:t>ShippingAddress nvarchar(600)</w:t>
+              <w:br/>
+              <w:t>Subtotal decimal(18,2)</w:t>
+              <w:br/>
+              <w:t>ShippingFee decimal(18,2)</w:t>
+              <w:br/>
+              <w:t>TotalAmount decimal(18,2)</w:t>
+              <w:br/>
+              <w:t>CustomerNote nvarchar(500) NULL</w:t>
+              <w:br/>
+              <w:t>CreatedAt, UpdatedAt datetime2</w:t>
+            </w:r>
+          </w:p>
+        </w:tc>
+        <w:tc>
+          <w:tcPr>
+            <w:tcW w:type="dxa" w:w="2948"/>
             <w:shd w:fill="EAF2F8"/>
             <w:vAlign w:val="center"/>
             <w:tcMar>
@@ -4466,7 +4842,7 @@
       <w:tr>
         <w:tc>
           <w:tcPr>
-            <w:tcW w:type="dxa" w:w="2948"/>
+            <w:tcW w:type="dxa" w:w="1814"/>
             <w:vAlign w:val="center"/>
             <w:tcMar>
               <w:top w:w="100" w:type="dxa"/>
@@ -4489,7 +4865,7 @@
         </w:tc>
         <w:tc>
           <w:tcPr>
-            <w:tcW w:type="dxa" w:w="6350"/>
+            <w:tcW w:type="dxa" w:w="4535"/>
             <w:vAlign w:val="center"/>
             <w:tcMar>
               <w:top w:w="100" w:type="dxa"/>
@@ -4506,7 +4882,46 @@
               <w:rPr>
                 <w:sz w:val="17"/>
               </w:rPr>
-              <w:t>Snapshot tên, SKU, giá và số lượng</w:t>
+              <w:t>Id bigint IDENTITY PK</w:t>
+              <w:br/>
+              <w:t>OrderId bigint FK</w:t>
+              <w:br/>
+              <w:t>ProductVariantId int FK</w:t>
+              <w:br/>
+              <w:t>ProductName nvarchar(200)</w:t>
+              <w:br/>
+              <w:t>Sku varchar(50)</w:t>
+              <w:br/>
+              <w:t>VariantDescription nvarchar(120) NULL</w:t>
+              <w:br/>
+              <w:t>UnitPrice decimal(18,2)</w:t>
+              <w:br/>
+              <w:t>Quantity int</w:t>
+              <w:br/>
+              <w:t>LineTotal decimal(18,2)</w:t>
+            </w:r>
+          </w:p>
+        </w:tc>
+        <w:tc>
+          <w:tcPr>
+            <w:tcW w:type="dxa" w:w="2948"/>
+            <w:vAlign w:val="center"/>
+            <w:tcMar>
+              <w:top w:w="100" w:type="dxa"/>
+              <w:start w:w="120" w:type="dxa"/>
+              <w:bottom w:w="100" w:type="dxa"/>
+              <w:end w:w="120" w:type="dxa"/>
+            </w:tcMar>
+          </w:tcPr>
+          <w:p>
+            <w:pPr>
+              <w:spacing w:after="0"/>
+            </w:pPr>
+            <w:r>
+              <w:rPr>
+                <w:sz w:val="17"/>
+              </w:rPr>
+              <w:t>Snapshot sản phẩm và giá lúc mua</w:t>
             </w:r>
           </w:p>
         </w:tc>
@@ -4514,7 +4929,7 @@
       <w:tr>
         <w:tc>
           <w:tcPr>
-            <w:tcW w:type="dxa" w:w="2948"/>
+            <w:tcW w:type="dxa" w:w="1814"/>
             <w:shd w:fill="EAF2F8"/>
             <w:vAlign w:val="center"/>
             <w:tcMar>
@@ -4538,7 +4953,7 @@
         </w:tc>
         <w:tc>
           <w:tcPr>
-            <w:tcW w:type="dxa" w:w="6350"/>
+            <w:tcW w:type="dxa" w:w="4535"/>
             <w:shd w:fill="EAF2F8"/>
             <w:vAlign w:val="center"/>
             <w:tcMar>
@@ -4556,12 +4971,102 @@
               <w:rPr>
                 <w:sz w:val="17"/>
               </w:rPr>
-              <w:t>Audit chuyển trạng thái</w:t>
+              <w:t>Id bigint IDENTITY PK</w:t>
+              <w:br/>
+              <w:t>OrderId bigint FK</w:t>
+              <w:br/>
+              <w:t>OldStatus int</w:t>
+              <w:br/>
+              <w:t>NewStatus int</w:t>
+              <w:br/>
+              <w:t>Note nvarchar(500) NULL</w:t>
+              <w:br/>
+              <w:t>ChangedByUserId nvarchar(450) FK NULL</w:t>
+              <w:br/>
+              <w:t>ChangedAt datetime2</w:t>
+            </w:r>
+          </w:p>
+        </w:tc>
+        <w:tc>
+          <w:tcPr>
+            <w:tcW w:type="dxa" w:w="2948"/>
+            <w:shd w:fill="EAF2F8"/>
+            <w:vAlign w:val="center"/>
+            <w:tcMar>
+              <w:top w:w="100" w:type="dxa"/>
+              <w:start w:w="120" w:type="dxa"/>
+              <w:bottom w:w="100" w:type="dxa"/>
+              <w:end w:w="120" w:type="dxa"/>
+            </w:tcMar>
+          </w:tcPr>
+          <w:p>
+            <w:pPr>
+              <w:spacing w:after="0"/>
+            </w:pPr>
+            <w:r>
+              <w:rPr>
+                <w:sz w:val="17"/>
+              </w:rPr>
+              <w:t>Audit mọi lần đổi trạng thái</w:t>
             </w:r>
           </w:p>
         </w:tc>
       </w:tr>
       <w:tr>
+        <w:tc>
+          <w:tcPr>
+            <w:tcW w:type="dxa" w:w="1814"/>
+            <w:vAlign w:val="center"/>
+            <w:tcMar>
+              <w:top w:w="100" w:type="dxa"/>
+              <w:start w:w="120" w:type="dxa"/>
+              <w:bottom w:w="100" w:type="dxa"/>
+              <w:end w:w="120" w:type="dxa"/>
+            </w:tcMar>
+          </w:tcPr>
+          <w:p>
+            <w:pPr>
+              <w:spacing w:after="0"/>
+            </w:pPr>
+            <w:r>
+              <w:rPr>
+                <w:sz w:val="17"/>
+              </w:rPr>
+              <w:t>AspNetUsers</w:t>
+            </w:r>
+          </w:p>
+        </w:tc>
+        <w:tc>
+          <w:tcPr>
+            <w:tcW w:type="dxa" w:w="4535"/>
+            <w:vAlign w:val="center"/>
+            <w:tcMar>
+              <w:top w:w="100" w:type="dxa"/>
+              <w:start w:w="120" w:type="dxa"/>
+              <w:bottom w:w="100" w:type="dxa"/>
+              <w:end w:w="120" w:type="dxa"/>
+            </w:tcMar>
+          </w:tcPr>
+          <w:p>
+            <w:pPr>
+              <w:spacing w:after="0"/>
+            </w:pPr>
+            <w:r>
+              <w:rPr>
+                <w:sz w:val="17"/>
+              </w:rPr>
+              <w:t>Id nvarchar(450) PK</w:t>
+              <w:br/>
+              <w:t>FullName nvarchar(150) NULL</w:t>
+              <w:br/>
+              <w:t>IsActive bit</w:t>
+              <w:br/>
+              <w:t>CreatedAt datetime2</w:t>
+              <w:br/>
+              <w:t>UserName, Email, PasswordHash và các cột Identity</w:t>
+            </w:r>
+          </w:p>
+        </w:tc>
         <w:tc>
           <w:tcPr>
             <w:tcW w:type="dxa" w:w="2948"/>
@@ -4581,13 +5086,16 @@
               <w:rPr>
                 <w:sz w:val="17"/>
               </w:rPr>
-              <w:t>AspNet tables</w:t>
+              <w:t>Identity sinh khóa chuỗi và hash mật khẩu</w:t>
             </w:r>
           </w:p>
         </w:tc>
+      </w:tr>
+      <w:tr>
         <w:tc>
           <w:tcPr>
-            <w:tcW w:type="dxa" w:w="6350"/>
+            <w:tcW w:type="dxa" w:w="1814"/>
+            <w:shd w:fill="EAF2F8"/>
             <w:vAlign w:val="center"/>
             <w:tcMar>
               <w:top w:w="100" w:type="dxa"/>
@@ -4604,7 +5112,140 @@
               <w:rPr>
                 <w:sz w:val="17"/>
               </w:rPr>
-              <w:t>Người dùng, role, claim, login và token do Identity quản lý</w:t>
+              <w:t>AspNetRoles</w:t>
+            </w:r>
+          </w:p>
+        </w:tc>
+        <w:tc>
+          <w:tcPr>
+            <w:tcW w:type="dxa" w:w="4535"/>
+            <w:shd w:fill="EAF2F8"/>
+            <w:vAlign w:val="center"/>
+            <w:tcMar>
+              <w:top w:w="100" w:type="dxa"/>
+              <w:start w:w="120" w:type="dxa"/>
+              <w:bottom w:w="100" w:type="dxa"/>
+              <w:end w:w="120" w:type="dxa"/>
+            </w:tcMar>
+          </w:tcPr>
+          <w:p>
+            <w:pPr>
+              <w:spacing w:after="0"/>
+            </w:pPr>
+            <w:r>
+              <w:rPr>
+                <w:sz w:val="17"/>
+              </w:rPr>
+              <w:t>Id nvarchar(450) PK</w:t>
+              <w:br/>
+              <w:t>Name nvarchar(256)</w:t>
+              <w:br/>
+              <w:t>NormalizedName nvarchar(256) UQ</w:t>
+              <w:br/>
+              <w:t>ConcurrencyStamp nvarchar(max)</w:t>
+            </w:r>
+          </w:p>
+        </w:tc>
+        <w:tc>
+          <w:tcPr>
+            <w:tcW w:type="dxa" w:w="2948"/>
+            <w:shd w:fill="EAF2F8"/>
+            <w:vAlign w:val="center"/>
+            <w:tcMar>
+              <w:top w:w="100" w:type="dxa"/>
+              <w:start w:w="120" w:type="dxa"/>
+              <w:bottom w:w="100" w:type="dxa"/>
+              <w:end w:w="120" w:type="dxa"/>
+            </w:tcMar>
+          </w:tcPr>
+          <w:p>
+            <w:pPr>
+              <w:spacing w:after="0"/>
+            </w:pPr>
+            <w:r>
+              <w:rPr>
+                <w:sz w:val="17"/>
+              </w:rPr>
+              <w:t>Role Admin và Customer</w:t>
+            </w:r>
+          </w:p>
+        </w:tc>
+      </w:tr>
+      <w:tr>
+        <w:tc>
+          <w:tcPr>
+            <w:tcW w:type="dxa" w:w="1814"/>
+            <w:vAlign w:val="center"/>
+            <w:tcMar>
+              <w:top w:w="100" w:type="dxa"/>
+              <w:start w:w="120" w:type="dxa"/>
+              <w:bottom w:w="100" w:type="dxa"/>
+              <w:end w:w="120" w:type="dxa"/>
+            </w:tcMar>
+          </w:tcPr>
+          <w:p>
+            <w:pPr>
+              <w:spacing w:after="0"/>
+            </w:pPr>
+            <w:r>
+              <w:rPr>
+                <w:sz w:val="17"/>
+              </w:rPr>
+              <w:t>Identity mapping</w:t>
+            </w:r>
+          </w:p>
+        </w:tc>
+        <w:tc>
+          <w:tcPr>
+            <w:tcW w:type="dxa" w:w="4535"/>
+            <w:vAlign w:val="center"/>
+            <w:tcMar>
+              <w:top w:w="100" w:type="dxa"/>
+              <w:start w:w="120" w:type="dxa"/>
+              <w:bottom w:w="100" w:type="dxa"/>
+              <w:end w:w="120" w:type="dxa"/>
+            </w:tcMar>
+          </w:tcPr>
+          <w:p>
+            <w:pPr>
+              <w:spacing w:after="0"/>
+            </w:pPr>
+            <w:r>
+              <w:rPr>
+                <w:sz w:val="17"/>
+              </w:rPr>
+              <w:t>AspNetUserRoles</w:t>
+              <w:br/>
+              <w:t>AspNetUserClaims</w:t>
+              <w:br/>
+              <w:t>AspNetRoleClaims</w:t>
+              <w:br/>
+              <w:t>AspNetUserLogins</w:t>
+              <w:br/>
+              <w:t>AspNetUserTokens</w:t>
+            </w:r>
+          </w:p>
+        </w:tc>
+        <w:tc>
+          <w:tcPr>
+            <w:tcW w:type="dxa" w:w="2948"/>
+            <w:vAlign w:val="center"/>
+            <w:tcMar>
+              <w:top w:w="100" w:type="dxa"/>
+              <w:start w:w="120" w:type="dxa"/>
+              <w:bottom w:w="100" w:type="dxa"/>
+              <w:end w:w="120" w:type="dxa"/>
+            </w:tcMar>
+          </w:tcPr>
+          <w:p>
+            <w:pPr>
+              <w:spacing w:after="0"/>
+            </w:pPr>
+            <w:r>
+              <w:rPr>
+                <w:sz w:val="17"/>
+              </w:rPr>
+              <w:t>Bảng liên kết và xác thực do Identity quản lý</w:t>
             </w:r>
           </w:p>
         </w:tc>
@@ -4653,6 +5294,14 @@
       </w:pPr>
       <w:r>
         <w:t>DATA_CREATE.sql tạo schema; DATA_INSERT.sql thêm role và catalog demo có thể chạy lại.</w:t>
+      </w:r>
+    </w:p>
+    <w:p>
+      <w:pPr>
+        <w:pStyle w:val="ListBullet"/>
+      </w:pPr>
+      <w:r>
+        <w:t>Entity Framework Core được cấu hình ValueGeneratedOnAdd cho toàn bộ khóa số để khớp IDENTITY(1,1).</w:t>
       </w:r>
     </w:p>
     <w:p>

</xml_diff>

<commit_message>
docs: add staff role and permissions
</commit_message>
<xml_diff>
--- a/docs/BikeShop_Project_Overview.docx
+++ b/docs/BikeShop_Project_Overview.docx
@@ -49,7 +49,7 @@
     </w:p>
     <w:p>
       <w:r>
-        <w:t>BikeShop tham khảo cách tổ chức catalog của xedap.vn nhưng sử dụng nội dung và giao diện riêng. Hệ thống phục vụ Guest, Customer và Admin; thanh toán COD là phương thức duy nhất trong phạm vi chính.</w:t>
+        <w:t>BikeShop tham khảo cách tổ chức catalog của xedap.vn nhưng sử dụng nội dung và giao diện riêng. Hệ thống phục vụ Guest, Customer, Staff và Admin; thanh toán COD là phương thức duy nhất trong phạm vi chính. Guest là người chưa đăng nhập, không phải role tài khoản trong database.</w:t>
       </w:r>
     </w:p>
     <w:tbl>
@@ -358,7 +358,7 @@
               <w:rPr>
                 <w:sz w:val="17"/>
               </w:rPr>
-              <w:t>Admin</w:t>
+              <w:t>Staff</w:t>
             </w:r>
           </w:p>
         </w:tc>
@@ -381,7 +381,57 @@
               <w:rPr>
                 <w:sz w:val="17"/>
               </w:rPr>
-              <w:t>Quản lý catalog, tồn kho, tài khoản, quy trình đơn và dashboard</w:t>
+              <w:t>Xử lý đơn hàng, cập nhật trạng thái, điều chỉnh tồn kho và xem cảnh báo sắp hết hàng</w:t>
+            </w:r>
+          </w:p>
+        </w:tc>
+      </w:tr>
+      <w:tr>
+        <w:tc>
+          <w:tcPr>
+            <w:tcW w:type="dxa" w:w="1928"/>
+            <w:shd w:fill="EAF2F8"/>
+            <w:vAlign w:val="center"/>
+            <w:tcMar>
+              <w:top w:w="100" w:type="dxa"/>
+              <w:start w:w="120" w:type="dxa"/>
+              <w:bottom w:w="100" w:type="dxa"/>
+              <w:end w:w="120" w:type="dxa"/>
+            </w:tcMar>
+          </w:tcPr>
+          <w:p>
+            <w:pPr>
+              <w:spacing w:after="0"/>
+            </w:pPr>
+            <w:r>
+              <w:rPr>
+                <w:sz w:val="17"/>
+              </w:rPr>
+              <w:t>Admin</w:t>
+            </w:r>
+          </w:p>
+        </w:tc>
+        <w:tc>
+          <w:tcPr>
+            <w:tcW w:type="dxa" w:w="7370"/>
+            <w:shd w:fill="EAF2F8"/>
+            <w:vAlign w:val="center"/>
+            <w:tcMar>
+              <w:top w:w="100" w:type="dxa"/>
+              <w:start w:w="120" w:type="dxa"/>
+              <w:bottom w:w="100" w:type="dxa"/>
+              <w:end w:w="120" w:type="dxa"/>
+            </w:tcMar>
+          </w:tcPr>
+          <w:p>
+            <w:pPr>
+              <w:spacing w:after="0"/>
+            </w:pPr>
+            <w:r>
+              <w:rPr>
+                <w:sz w:val="17"/>
+              </w:rPr>
+              <w:t>Quản lý catalog, tài khoản nhân viên, phân quyền, toàn bộ đơn hàng và dashboard</w:t>
             </w:r>
           </w:p>
         </w:tc>
@@ -460,7 +510,7 @@
     </w:p>
     <w:p>
       <w:r>
-        <w:t>Pending → Confirmed → Packing → Shipping → Completed. Đơn Pending hoặc Confirmed có thể chuyển sang Cancelled theo quyền và business rule.</w:t>
+        <w:t>Staff xử lý Pending → Confirmed → Packing → Shipping → Completed. Đơn Pending hoặc Confirmed có thể chuyển sang Cancelled theo quyền và business rule. Admin có thể giám sát toàn bộ hàng đợi và dashboard.</w:t>
       </w:r>
     </w:p>
     <w:p>
@@ -1158,7 +1208,7 @@
               <w:rPr>
                 <w:sz w:val="17"/>
               </w:rPr>
-              <w:t>Admin khóa, mở và phân quyền tài khoản</w:t>
+              <w:t>Admin tạo, khóa, mở và gán role Staff cho tài khoản nội bộ</w:t>
             </w:r>
           </w:p>
         </w:tc>
@@ -2838,7 +2888,7 @@
               <w:rPr>
                 <w:sz w:val="17"/>
               </w:rPr>
-              <w:t>Admin Catalog</w:t>
+              <w:t>Catalog Inventory</w:t>
             </w:r>
           </w:p>
         </w:tc>
@@ -2886,7 +2936,7 @@
               <w:rPr>
                 <w:sz w:val="17"/>
               </w:rPr>
-              <w:t>Điều chỉnh và xem lịch sử tồn kho</w:t>
+              <w:t>Staff hoặc Admin điều chỉnh và xem lịch sử tồn kho</w:t>
             </w:r>
           </w:p>
         </w:tc>
@@ -3172,7 +3222,7 @@
               <w:rPr>
                 <w:sz w:val="17"/>
               </w:rPr>
-              <w:t>Admin tìm và lọc hàng đợi đơn</w:t>
+              <w:t>Staff hoặc Admin tìm và lọc hàng đợi đơn</w:t>
             </w:r>
           </w:p>
         </w:tc>
@@ -3270,7 +3320,7 @@
               <w:rPr>
                 <w:sz w:val="17"/>
               </w:rPr>
-              <w:t>Chuyển trạng thái và ghi lịch sử</w:t>
+              <w:t>Staff chuyển trạng thái và hệ thống ghi lịch sử</w:t>
             </w:r>
           </w:p>
         </w:tc>
@@ -3462,7 +3512,7 @@
               <w:rPr>
                 <w:sz w:val="17"/>
               </w:rPr>
-              <w:t>Báo cáo sản phẩm sắp hết hàng</w:t>
+              <w:t>Staff hoặc Admin xem sản phẩm sắp hết hàng</w:t>
             </w:r>
           </w:p>
         </w:tc>
@@ -3740,7 +3790,7 @@
               <w:rPr>
                 <w:sz w:val="17"/>
               </w:rPr>
-              <w:t>ASP.NET Core Identity, role Admin và Customer</w:t>
+              <w:t>ASP.NET Core Identity, role Customer, Staff và Admin; Guest là người chưa xác thực</w:t>
             </w:r>
           </w:p>
         </w:tc>
@@ -5166,7 +5216,7 @@
               <w:rPr>
                 <w:sz w:val="17"/>
               </w:rPr>
-              <w:t>Role Admin và Customer</w:t>
+              <w:t>Ba role tài khoản Customer, Staff và Admin</w:t>
             </w:r>
           </w:p>
         </w:tc>
@@ -5303,6 +5353,1111 @@
       <w:r>
         <w:t>Entity Framework Core được cấu hình ValueGeneratedOnAdd cho toàn bộ khóa số để khớp IDENTITY(1,1).</w:t>
       </w:r>
+    </w:p>
+    <w:p>
+      <w:pPr>
+        <w:pStyle w:val="Heading2"/>
+      </w:pPr>
+      <w:r>
+        <w:t>5.1 Ma trận quyền</w:t>
+      </w:r>
+    </w:p>
+    <w:tbl>
+      <w:tblPr>
+        <w:tblStyle w:val="TableGrid"/>
+        <w:tblW w:type="auto" w:w="0"/>
+        <w:jc w:val="center"/>
+        <w:tblLayout w:type="fixed"/>
+        <w:tblLook w:firstColumn="1" w:firstRow="1" w:lastColumn="0" w:lastRow="0" w:noHBand="0" w:noVBand="1" w:val="04A0"/>
+      </w:tblPr>
+      <w:tblGrid>
+        <w:gridCol w:w="1994"/>
+        <w:gridCol w:w="1994"/>
+        <w:gridCol w:w="1994"/>
+        <w:gridCol w:w="1994"/>
+        <w:gridCol w:w="1994"/>
+      </w:tblGrid>
+      <w:tr>
+        <w:trPr>
+          <w:tblHeader w:val="true"/>
+        </w:trPr>
+        <w:tc>
+          <w:tcPr>
+            <w:tcW w:type="dxa" w:w="3288"/>
+            <w:shd w:fill="1F4E78"/>
+            <w:vAlign w:val="center"/>
+            <w:tcMar>
+              <w:top w:w="100" w:type="dxa"/>
+              <w:start w:w="120" w:type="dxa"/>
+              <w:bottom w:w="100" w:type="dxa"/>
+              <w:end w:w="120" w:type="dxa"/>
+            </w:tcMar>
+          </w:tcPr>
+          <w:p>
+            <w:r>
+              <w:rPr>
+                <w:b/>
+                <w:color w:val="FFFFFF"/>
+                <w:sz w:val="18"/>
+              </w:rPr>
+              <w:t>Nghiệp vụ</w:t>
+            </w:r>
+          </w:p>
+        </w:tc>
+        <w:tc>
+          <w:tcPr>
+            <w:tcW w:type="dxa" w:w="1247"/>
+            <w:shd w:fill="1F4E78"/>
+            <w:vAlign w:val="center"/>
+            <w:tcMar>
+              <w:top w:w="100" w:type="dxa"/>
+              <w:start w:w="120" w:type="dxa"/>
+              <w:bottom w:w="100" w:type="dxa"/>
+              <w:end w:w="120" w:type="dxa"/>
+            </w:tcMar>
+          </w:tcPr>
+          <w:p>
+            <w:r>
+              <w:rPr>
+                <w:b/>
+                <w:color w:val="FFFFFF"/>
+                <w:sz w:val="18"/>
+              </w:rPr>
+              <w:t>Guest</w:t>
+            </w:r>
+          </w:p>
+        </w:tc>
+        <w:tc>
+          <w:tcPr>
+            <w:tcW w:type="dxa" w:w="1474"/>
+            <w:shd w:fill="1F4E78"/>
+            <w:vAlign w:val="center"/>
+            <w:tcMar>
+              <w:top w:w="100" w:type="dxa"/>
+              <w:start w:w="120" w:type="dxa"/>
+              <w:bottom w:w="100" w:type="dxa"/>
+              <w:end w:w="120" w:type="dxa"/>
+            </w:tcMar>
+          </w:tcPr>
+          <w:p>
+            <w:r>
+              <w:rPr>
+                <w:b/>
+                <w:color w:val="FFFFFF"/>
+                <w:sz w:val="18"/>
+              </w:rPr>
+              <w:t>Customer</w:t>
+            </w:r>
+          </w:p>
+        </w:tc>
+        <w:tc>
+          <w:tcPr>
+            <w:tcW w:type="dxa" w:w="1474"/>
+            <w:shd w:fill="1F4E78"/>
+            <w:vAlign w:val="center"/>
+            <w:tcMar>
+              <w:top w:w="100" w:type="dxa"/>
+              <w:start w:w="120" w:type="dxa"/>
+              <w:bottom w:w="100" w:type="dxa"/>
+              <w:end w:w="120" w:type="dxa"/>
+            </w:tcMar>
+          </w:tcPr>
+          <w:p>
+            <w:r>
+              <w:rPr>
+                <w:b/>
+                <w:color w:val="FFFFFF"/>
+                <w:sz w:val="18"/>
+              </w:rPr>
+              <w:t>Staff</w:t>
+            </w:r>
+          </w:p>
+        </w:tc>
+        <w:tc>
+          <w:tcPr>
+            <w:tcW w:type="dxa" w:w="1474"/>
+            <w:shd w:fill="1F4E78"/>
+            <w:vAlign w:val="center"/>
+            <w:tcMar>
+              <w:top w:w="100" w:type="dxa"/>
+              <w:start w:w="120" w:type="dxa"/>
+              <w:bottom w:w="100" w:type="dxa"/>
+              <w:end w:w="120" w:type="dxa"/>
+            </w:tcMar>
+          </w:tcPr>
+          <w:p>
+            <w:r>
+              <w:rPr>
+                <w:b/>
+                <w:color w:val="FFFFFF"/>
+                <w:sz w:val="18"/>
+              </w:rPr>
+              <w:t>Admin</w:t>
+            </w:r>
+          </w:p>
+        </w:tc>
+      </w:tr>
+      <w:tr>
+        <w:tc>
+          <w:tcPr>
+            <w:tcW w:type="dxa" w:w="3288"/>
+            <w:vAlign w:val="center"/>
+            <w:tcMar>
+              <w:top w:w="100" w:type="dxa"/>
+              <w:start w:w="120" w:type="dxa"/>
+              <w:bottom w:w="100" w:type="dxa"/>
+              <w:end w:w="120" w:type="dxa"/>
+            </w:tcMar>
+          </w:tcPr>
+          <w:p>
+            <w:pPr>
+              <w:spacing w:after="0"/>
+            </w:pPr>
+            <w:r>
+              <w:rPr>
+                <w:sz w:val="17"/>
+              </w:rPr>
+              <w:t>Xem catalog</w:t>
+            </w:r>
+          </w:p>
+        </w:tc>
+        <w:tc>
+          <w:tcPr>
+            <w:tcW w:type="dxa" w:w="1247"/>
+            <w:vAlign w:val="center"/>
+            <w:tcMar>
+              <w:top w:w="100" w:type="dxa"/>
+              <w:start w:w="120" w:type="dxa"/>
+              <w:bottom w:w="100" w:type="dxa"/>
+              <w:end w:w="120" w:type="dxa"/>
+            </w:tcMar>
+          </w:tcPr>
+          <w:p>
+            <w:pPr>
+              <w:spacing w:after="0"/>
+            </w:pPr>
+            <w:r>
+              <w:rPr>
+                <w:sz w:val="17"/>
+              </w:rPr>
+              <w:t>Có</w:t>
+            </w:r>
+          </w:p>
+        </w:tc>
+        <w:tc>
+          <w:tcPr>
+            <w:tcW w:type="dxa" w:w="1474"/>
+            <w:vAlign w:val="center"/>
+            <w:tcMar>
+              <w:top w:w="100" w:type="dxa"/>
+              <w:start w:w="120" w:type="dxa"/>
+              <w:bottom w:w="100" w:type="dxa"/>
+              <w:end w:w="120" w:type="dxa"/>
+            </w:tcMar>
+          </w:tcPr>
+          <w:p>
+            <w:pPr>
+              <w:spacing w:after="0"/>
+            </w:pPr>
+            <w:r>
+              <w:rPr>
+                <w:sz w:val="17"/>
+              </w:rPr>
+              <w:t>Có</w:t>
+            </w:r>
+          </w:p>
+        </w:tc>
+        <w:tc>
+          <w:tcPr>
+            <w:tcW w:type="dxa" w:w="1474"/>
+            <w:vAlign w:val="center"/>
+            <w:tcMar>
+              <w:top w:w="100" w:type="dxa"/>
+              <w:start w:w="120" w:type="dxa"/>
+              <w:bottom w:w="100" w:type="dxa"/>
+              <w:end w:w="120" w:type="dxa"/>
+            </w:tcMar>
+          </w:tcPr>
+          <w:p>
+            <w:pPr>
+              <w:spacing w:after="0"/>
+            </w:pPr>
+            <w:r>
+              <w:rPr>
+                <w:sz w:val="17"/>
+              </w:rPr>
+              <w:t>Có</w:t>
+            </w:r>
+          </w:p>
+        </w:tc>
+        <w:tc>
+          <w:tcPr>
+            <w:tcW w:type="dxa" w:w="1474"/>
+            <w:vAlign w:val="center"/>
+            <w:tcMar>
+              <w:top w:w="100" w:type="dxa"/>
+              <w:start w:w="120" w:type="dxa"/>
+              <w:bottom w:w="100" w:type="dxa"/>
+              <w:end w:w="120" w:type="dxa"/>
+            </w:tcMar>
+          </w:tcPr>
+          <w:p>
+            <w:pPr>
+              <w:spacing w:after="0"/>
+            </w:pPr>
+            <w:r>
+              <w:rPr>
+                <w:sz w:val="17"/>
+              </w:rPr>
+              <w:t>Có</w:t>
+            </w:r>
+          </w:p>
+        </w:tc>
+      </w:tr>
+      <w:tr>
+        <w:tc>
+          <w:tcPr>
+            <w:tcW w:type="dxa" w:w="3288"/>
+            <w:shd w:fill="EAF2F8"/>
+            <w:vAlign w:val="center"/>
+            <w:tcMar>
+              <w:top w:w="100" w:type="dxa"/>
+              <w:start w:w="120" w:type="dxa"/>
+              <w:bottom w:w="100" w:type="dxa"/>
+              <w:end w:w="120" w:type="dxa"/>
+            </w:tcMar>
+          </w:tcPr>
+          <w:p>
+            <w:pPr>
+              <w:spacing w:after="0"/>
+            </w:pPr>
+            <w:r>
+              <w:rPr>
+                <w:sz w:val="17"/>
+              </w:rPr>
+              <w:t>Giỏ hàng và đặt hàng</w:t>
+            </w:r>
+          </w:p>
+        </w:tc>
+        <w:tc>
+          <w:tcPr>
+            <w:tcW w:type="dxa" w:w="1247"/>
+            <w:shd w:fill="EAF2F8"/>
+            <w:vAlign w:val="center"/>
+            <w:tcMar>
+              <w:top w:w="100" w:type="dxa"/>
+              <w:start w:w="120" w:type="dxa"/>
+              <w:bottom w:w="100" w:type="dxa"/>
+              <w:end w:w="120" w:type="dxa"/>
+            </w:tcMar>
+          </w:tcPr>
+          <w:p>
+            <w:pPr>
+              <w:spacing w:after="0"/>
+            </w:pPr>
+            <w:r>
+              <w:rPr>
+                <w:sz w:val="17"/>
+              </w:rPr>
+              <w:t>Không</w:t>
+            </w:r>
+          </w:p>
+        </w:tc>
+        <w:tc>
+          <w:tcPr>
+            <w:tcW w:type="dxa" w:w="1474"/>
+            <w:shd w:fill="EAF2F8"/>
+            <w:vAlign w:val="center"/>
+            <w:tcMar>
+              <w:top w:w="100" w:type="dxa"/>
+              <w:start w:w="120" w:type="dxa"/>
+              <w:bottom w:w="100" w:type="dxa"/>
+              <w:end w:w="120" w:type="dxa"/>
+            </w:tcMar>
+          </w:tcPr>
+          <w:p>
+            <w:pPr>
+              <w:spacing w:after="0"/>
+            </w:pPr>
+            <w:r>
+              <w:rPr>
+                <w:sz w:val="17"/>
+              </w:rPr>
+              <w:t>Có</w:t>
+            </w:r>
+          </w:p>
+        </w:tc>
+        <w:tc>
+          <w:tcPr>
+            <w:tcW w:type="dxa" w:w="1474"/>
+            <w:shd w:fill="EAF2F8"/>
+            <w:vAlign w:val="center"/>
+            <w:tcMar>
+              <w:top w:w="100" w:type="dxa"/>
+              <w:start w:w="120" w:type="dxa"/>
+              <w:bottom w:w="100" w:type="dxa"/>
+              <w:end w:w="120" w:type="dxa"/>
+            </w:tcMar>
+          </w:tcPr>
+          <w:p>
+            <w:pPr>
+              <w:spacing w:after="0"/>
+            </w:pPr>
+            <w:r>
+              <w:rPr>
+                <w:sz w:val="17"/>
+              </w:rPr>
+              <w:t>Không</w:t>
+            </w:r>
+          </w:p>
+        </w:tc>
+        <w:tc>
+          <w:tcPr>
+            <w:tcW w:type="dxa" w:w="1474"/>
+            <w:shd w:fill="EAF2F8"/>
+            <w:vAlign w:val="center"/>
+            <w:tcMar>
+              <w:top w:w="100" w:type="dxa"/>
+              <w:start w:w="120" w:type="dxa"/>
+              <w:bottom w:w="100" w:type="dxa"/>
+              <w:end w:w="120" w:type="dxa"/>
+            </w:tcMar>
+          </w:tcPr>
+          <w:p>
+            <w:pPr>
+              <w:spacing w:after="0"/>
+            </w:pPr>
+            <w:r>
+              <w:rPr>
+                <w:sz w:val="17"/>
+              </w:rPr>
+              <w:t>Không</w:t>
+            </w:r>
+          </w:p>
+        </w:tc>
+      </w:tr>
+      <w:tr>
+        <w:tc>
+          <w:tcPr>
+            <w:tcW w:type="dxa" w:w="3288"/>
+            <w:vAlign w:val="center"/>
+            <w:tcMar>
+              <w:top w:w="100" w:type="dxa"/>
+              <w:start w:w="120" w:type="dxa"/>
+              <w:bottom w:w="100" w:type="dxa"/>
+              <w:end w:w="120" w:type="dxa"/>
+            </w:tcMar>
+          </w:tcPr>
+          <w:p>
+            <w:pPr>
+              <w:spacing w:after="0"/>
+            </w:pPr>
+            <w:r>
+              <w:rPr>
+                <w:sz w:val="17"/>
+              </w:rPr>
+              <w:t>Xem và hủy đơn của mình</w:t>
+            </w:r>
+          </w:p>
+        </w:tc>
+        <w:tc>
+          <w:tcPr>
+            <w:tcW w:type="dxa" w:w="1247"/>
+            <w:vAlign w:val="center"/>
+            <w:tcMar>
+              <w:top w:w="100" w:type="dxa"/>
+              <w:start w:w="120" w:type="dxa"/>
+              <w:bottom w:w="100" w:type="dxa"/>
+              <w:end w:w="120" w:type="dxa"/>
+            </w:tcMar>
+          </w:tcPr>
+          <w:p>
+            <w:pPr>
+              <w:spacing w:after="0"/>
+            </w:pPr>
+            <w:r>
+              <w:rPr>
+                <w:sz w:val="17"/>
+              </w:rPr>
+              <w:t>Không</w:t>
+            </w:r>
+          </w:p>
+        </w:tc>
+        <w:tc>
+          <w:tcPr>
+            <w:tcW w:type="dxa" w:w="1474"/>
+            <w:vAlign w:val="center"/>
+            <w:tcMar>
+              <w:top w:w="100" w:type="dxa"/>
+              <w:start w:w="120" w:type="dxa"/>
+              <w:bottom w:w="100" w:type="dxa"/>
+              <w:end w:w="120" w:type="dxa"/>
+            </w:tcMar>
+          </w:tcPr>
+          <w:p>
+            <w:pPr>
+              <w:spacing w:after="0"/>
+            </w:pPr>
+            <w:r>
+              <w:rPr>
+                <w:sz w:val="17"/>
+              </w:rPr>
+              <w:t>Có</w:t>
+            </w:r>
+          </w:p>
+        </w:tc>
+        <w:tc>
+          <w:tcPr>
+            <w:tcW w:type="dxa" w:w="1474"/>
+            <w:vAlign w:val="center"/>
+            <w:tcMar>
+              <w:top w:w="100" w:type="dxa"/>
+              <w:start w:w="120" w:type="dxa"/>
+              <w:bottom w:w="100" w:type="dxa"/>
+              <w:end w:w="120" w:type="dxa"/>
+            </w:tcMar>
+          </w:tcPr>
+          <w:p>
+            <w:pPr>
+              <w:spacing w:after="0"/>
+            </w:pPr>
+            <w:r>
+              <w:rPr>
+                <w:sz w:val="17"/>
+              </w:rPr>
+              <w:t>Không</w:t>
+            </w:r>
+          </w:p>
+        </w:tc>
+        <w:tc>
+          <w:tcPr>
+            <w:tcW w:type="dxa" w:w="1474"/>
+            <w:vAlign w:val="center"/>
+            <w:tcMar>
+              <w:top w:w="100" w:type="dxa"/>
+              <w:start w:w="120" w:type="dxa"/>
+              <w:bottom w:w="100" w:type="dxa"/>
+              <w:end w:w="120" w:type="dxa"/>
+            </w:tcMar>
+          </w:tcPr>
+          <w:p>
+            <w:pPr>
+              <w:spacing w:after="0"/>
+            </w:pPr>
+            <w:r>
+              <w:rPr>
+                <w:sz w:val="17"/>
+              </w:rPr>
+              <w:t>Không</w:t>
+            </w:r>
+          </w:p>
+        </w:tc>
+      </w:tr>
+      <w:tr>
+        <w:tc>
+          <w:tcPr>
+            <w:tcW w:type="dxa" w:w="3288"/>
+            <w:shd w:fill="EAF2F8"/>
+            <w:vAlign w:val="center"/>
+            <w:tcMar>
+              <w:top w:w="100" w:type="dxa"/>
+              <w:start w:w="120" w:type="dxa"/>
+              <w:bottom w:w="100" w:type="dxa"/>
+              <w:end w:w="120" w:type="dxa"/>
+            </w:tcMar>
+          </w:tcPr>
+          <w:p>
+            <w:pPr>
+              <w:spacing w:after="0"/>
+            </w:pPr>
+            <w:r>
+              <w:rPr>
+                <w:sz w:val="17"/>
+              </w:rPr>
+              <w:t>Xử lý đơn và cập nhật trạng thái</w:t>
+            </w:r>
+          </w:p>
+        </w:tc>
+        <w:tc>
+          <w:tcPr>
+            <w:tcW w:type="dxa" w:w="1247"/>
+            <w:shd w:fill="EAF2F8"/>
+            <w:vAlign w:val="center"/>
+            <w:tcMar>
+              <w:top w:w="100" w:type="dxa"/>
+              <w:start w:w="120" w:type="dxa"/>
+              <w:bottom w:w="100" w:type="dxa"/>
+              <w:end w:w="120" w:type="dxa"/>
+            </w:tcMar>
+          </w:tcPr>
+          <w:p>
+            <w:pPr>
+              <w:spacing w:after="0"/>
+            </w:pPr>
+            <w:r>
+              <w:rPr>
+                <w:sz w:val="17"/>
+              </w:rPr>
+              <w:t>Không</w:t>
+            </w:r>
+          </w:p>
+        </w:tc>
+        <w:tc>
+          <w:tcPr>
+            <w:tcW w:type="dxa" w:w="1474"/>
+            <w:shd w:fill="EAF2F8"/>
+            <w:vAlign w:val="center"/>
+            <w:tcMar>
+              <w:top w:w="100" w:type="dxa"/>
+              <w:start w:w="120" w:type="dxa"/>
+              <w:bottom w:w="100" w:type="dxa"/>
+              <w:end w:w="120" w:type="dxa"/>
+            </w:tcMar>
+          </w:tcPr>
+          <w:p>
+            <w:pPr>
+              <w:spacing w:after="0"/>
+            </w:pPr>
+            <w:r>
+              <w:rPr>
+                <w:sz w:val="17"/>
+              </w:rPr>
+              <w:t>Không</w:t>
+            </w:r>
+          </w:p>
+        </w:tc>
+        <w:tc>
+          <w:tcPr>
+            <w:tcW w:type="dxa" w:w="1474"/>
+            <w:shd w:fill="EAF2F8"/>
+            <w:vAlign w:val="center"/>
+            <w:tcMar>
+              <w:top w:w="100" w:type="dxa"/>
+              <w:start w:w="120" w:type="dxa"/>
+              <w:bottom w:w="100" w:type="dxa"/>
+              <w:end w:w="120" w:type="dxa"/>
+            </w:tcMar>
+          </w:tcPr>
+          <w:p>
+            <w:pPr>
+              <w:spacing w:after="0"/>
+            </w:pPr>
+            <w:r>
+              <w:rPr>
+                <w:sz w:val="17"/>
+              </w:rPr>
+              <w:t>Có</w:t>
+            </w:r>
+          </w:p>
+        </w:tc>
+        <w:tc>
+          <w:tcPr>
+            <w:tcW w:type="dxa" w:w="1474"/>
+            <w:shd w:fill="EAF2F8"/>
+            <w:vAlign w:val="center"/>
+            <w:tcMar>
+              <w:top w:w="100" w:type="dxa"/>
+              <w:start w:w="120" w:type="dxa"/>
+              <w:bottom w:w="100" w:type="dxa"/>
+              <w:end w:w="120" w:type="dxa"/>
+            </w:tcMar>
+          </w:tcPr>
+          <w:p>
+            <w:pPr>
+              <w:spacing w:after="0"/>
+            </w:pPr>
+            <w:r>
+              <w:rPr>
+                <w:sz w:val="17"/>
+              </w:rPr>
+              <w:t>Có</w:t>
+            </w:r>
+          </w:p>
+        </w:tc>
+      </w:tr>
+      <w:tr>
+        <w:tc>
+          <w:tcPr>
+            <w:tcW w:type="dxa" w:w="3288"/>
+            <w:vAlign w:val="center"/>
+            <w:tcMar>
+              <w:top w:w="100" w:type="dxa"/>
+              <w:start w:w="120" w:type="dxa"/>
+              <w:bottom w:w="100" w:type="dxa"/>
+              <w:end w:w="120" w:type="dxa"/>
+            </w:tcMar>
+          </w:tcPr>
+          <w:p>
+            <w:pPr>
+              <w:spacing w:after="0"/>
+            </w:pPr>
+            <w:r>
+              <w:rPr>
+                <w:sz w:val="17"/>
+              </w:rPr>
+              <w:t>Điều chỉnh tồn kho</w:t>
+            </w:r>
+          </w:p>
+        </w:tc>
+        <w:tc>
+          <w:tcPr>
+            <w:tcW w:type="dxa" w:w="1247"/>
+            <w:vAlign w:val="center"/>
+            <w:tcMar>
+              <w:top w:w="100" w:type="dxa"/>
+              <w:start w:w="120" w:type="dxa"/>
+              <w:bottom w:w="100" w:type="dxa"/>
+              <w:end w:w="120" w:type="dxa"/>
+            </w:tcMar>
+          </w:tcPr>
+          <w:p>
+            <w:pPr>
+              <w:spacing w:after="0"/>
+            </w:pPr>
+            <w:r>
+              <w:rPr>
+                <w:sz w:val="17"/>
+              </w:rPr>
+              <w:t>Không</w:t>
+            </w:r>
+          </w:p>
+        </w:tc>
+        <w:tc>
+          <w:tcPr>
+            <w:tcW w:type="dxa" w:w="1474"/>
+            <w:vAlign w:val="center"/>
+            <w:tcMar>
+              <w:top w:w="100" w:type="dxa"/>
+              <w:start w:w="120" w:type="dxa"/>
+              <w:bottom w:w="100" w:type="dxa"/>
+              <w:end w:w="120" w:type="dxa"/>
+            </w:tcMar>
+          </w:tcPr>
+          <w:p>
+            <w:pPr>
+              <w:spacing w:after="0"/>
+            </w:pPr>
+            <w:r>
+              <w:rPr>
+                <w:sz w:val="17"/>
+              </w:rPr>
+              <w:t>Không</w:t>
+            </w:r>
+          </w:p>
+        </w:tc>
+        <w:tc>
+          <w:tcPr>
+            <w:tcW w:type="dxa" w:w="1474"/>
+            <w:vAlign w:val="center"/>
+            <w:tcMar>
+              <w:top w:w="100" w:type="dxa"/>
+              <w:start w:w="120" w:type="dxa"/>
+              <w:bottom w:w="100" w:type="dxa"/>
+              <w:end w:w="120" w:type="dxa"/>
+            </w:tcMar>
+          </w:tcPr>
+          <w:p>
+            <w:pPr>
+              <w:spacing w:after="0"/>
+            </w:pPr>
+            <w:r>
+              <w:rPr>
+                <w:sz w:val="17"/>
+              </w:rPr>
+              <w:t>Có</w:t>
+            </w:r>
+          </w:p>
+        </w:tc>
+        <w:tc>
+          <w:tcPr>
+            <w:tcW w:type="dxa" w:w="1474"/>
+            <w:vAlign w:val="center"/>
+            <w:tcMar>
+              <w:top w:w="100" w:type="dxa"/>
+              <w:start w:w="120" w:type="dxa"/>
+              <w:bottom w:w="100" w:type="dxa"/>
+              <w:end w:w="120" w:type="dxa"/>
+            </w:tcMar>
+          </w:tcPr>
+          <w:p>
+            <w:pPr>
+              <w:spacing w:after="0"/>
+            </w:pPr>
+            <w:r>
+              <w:rPr>
+                <w:sz w:val="17"/>
+              </w:rPr>
+              <w:t>Có</w:t>
+            </w:r>
+          </w:p>
+        </w:tc>
+      </w:tr>
+      <w:tr>
+        <w:tc>
+          <w:tcPr>
+            <w:tcW w:type="dxa" w:w="3288"/>
+            <w:shd w:fill="EAF2F8"/>
+            <w:vAlign w:val="center"/>
+            <w:tcMar>
+              <w:top w:w="100" w:type="dxa"/>
+              <w:start w:w="120" w:type="dxa"/>
+              <w:bottom w:w="100" w:type="dxa"/>
+              <w:end w:w="120" w:type="dxa"/>
+            </w:tcMar>
+          </w:tcPr>
+          <w:p>
+            <w:pPr>
+              <w:spacing w:after="0"/>
+            </w:pPr>
+            <w:r>
+              <w:rPr>
+                <w:sz w:val="17"/>
+              </w:rPr>
+              <w:t>Quản lý catalog</w:t>
+            </w:r>
+          </w:p>
+        </w:tc>
+        <w:tc>
+          <w:tcPr>
+            <w:tcW w:type="dxa" w:w="1247"/>
+            <w:shd w:fill="EAF2F8"/>
+            <w:vAlign w:val="center"/>
+            <w:tcMar>
+              <w:top w:w="100" w:type="dxa"/>
+              <w:start w:w="120" w:type="dxa"/>
+              <w:bottom w:w="100" w:type="dxa"/>
+              <w:end w:w="120" w:type="dxa"/>
+            </w:tcMar>
+          </w:tcPr>
+          <w:p>
+            <w:pPr>
+              <w:spacing w:after="0"/>
+            </w:pPr>
+            <w:r>
+              <w:rPr>
+                <w:sz w:val="17"/>
+              </w:rPr>
+              <w:t>Không</w:t>
+            </w:r>
+          </w:p>
+        </w:tc>
+        <w:tc>
+          <w:tcPr>
+            <w:tcW w:type="dxa" w:w="1474"/>
+            <w:shd w:fill="EAF2F8"/>
+            <w:vAlign w:val="center"/>
+            <w:tcMar>
+              <w:top w:w="100" w:type="dxa"/>
+              <w:start w:w="120" w:type="dxa"/>
+              <w:bottom w:w="100" w:type="dxa"/>
+              <w:end w:w="120" w:type="dxa"/>
+            </w:tcMar>
+          </w:tcPr>
+          <w:p>
+            <w:pPr>
+              <w:spacing w:after="0"/>
+            </w:pPr>
+            <w:r>
+              <w:rPr>
+                <w:sz w:val="17"/>
+              </w:rPr>
+              <w:t>Không</w:t>
+            </w:r>
+          </w:p>
+        </w:tc>
+        <w:tc>
+          <w:tcPr>
+            <w:tcW w:type="dxa" w:w="1474"/>
+            <w:shd w:fill="EAF2F8"/>
+            <w:vAlign w:val="center"/>
+            <w:tcMar>
+              <w:top w:w="100" w:type="dxa"/>
+              <w:start w:w="120" w:type="dxa"/>
+              <w:bottom w:w="100" w:type="dxa"/>
+              <w:end w:w="120" w:type="dxa"/>
+            </w:tcMar>
+          </w:tcPr>
+          <w:p>
+            <w:pPr>
+              <w:spacing w:after="0"/>
+            </w:pPr>
+            <w:r>
+              <w:rPr>
+                <w:sz w:val="17"/>
+              </w:rPr>
+              <w:t>Không</w:t>
+            </w:r>
+          </w:p>
+        </w:tc>
+        <w:tc>
+          <w:tcPr>
+            <w:tcW w:type="dxa" w:w="1474"/>
+            <w:shd w:fill="EAF2F8"/>
+            <w:vAlign w:val="center"/>
+            <w:tcMar>
+              <w:top w:w="100" w:type="dxa"/>
+              <w:start w:w="120" w:type="dxa"/>
+              <w:bottom w:w="100" w:type="dxa"/>
+              <w:end w:w="120" w:type="dxa"/>
+            </w:tcMar>
+          </w:tcPr>
+          <w:p>
+            <w:pPr>
+              <w:spacing w:after="0"/>
+            </w:pPr>
+            <w:r>
+              <w:rPr>
+                <w:sz w:val="17"/>
+              </w:rPr>
+              <w:t>Có</w:t>
+            </w:r>
+          </w:p>
+        </w:tc>
+      </w:tr>
+      <w:tr>
+        <w:tc>
+          <w:tcPr>
+            <w:tcW w:type="dxa" w:w="3288"/>
+            <w:vAlign w:val="center"/>
+            <w:tcMar>
+              <w:top w:w="100" w:type="dxa"/>
+              <w:start w:w="120" w:type="dxa"/>
+              <w:bottom w:w="100" w:type="dxa"/>
+              <w:end w:w="120" w:type="dxa"/>
+            </w:tcMar>
+          </w:tcPr>
+          <w:p>
+            <w:pPr>
+              <w:spacing w:after="0"/>
+            </w:pPr>
+            <w:r>
+              <w:rPr>
+                <w:sz w:val="17"/>
+              </w:rPr>
+              <w:t>Quản lý tài khoản Staff và phân quyền</w:t>
+            </w:r>
+          </w:p>
+        </w:tc>
+        <w:tc>
+          <w:tcPr>
+            <w:tcW w:type="dxa" w:w="1247"/>
+            <w:vAlign w:val="center"/>
+            <w:tcMar>
+              <w:top w:w="100" w:type="dxa"/>
+              <w:start w:w="120" w:type="dxa"/>
+              <w:bottom w:w="100" w:type="dxa"/>
+              <w:end w:w="120" w:type="dxa"/>
+            </w:tcMar>
+          </w:tcPr>
+          <w:p>
+            <w:pPr>
+              <w:spacing w:after="0"/>
+            </w:pPr>
+            <w:r>
+              <w:rPr>
+                <w:sz w:val="17"/>
+              </w:rPr>
+              <w:t>Không</w:t>
+            </w:r>
+          </w:p>
+        </w:tc>
+        <w:tc>
+          <w:tcPr>
+            <w:tcW w:type="dxa" w:w="1474"/>
+            <w:vAlign w:val="center"/>
+            <w:tcMar>
+              <w:top w:w="100" w:type="dxa"/>
+              <w:start w:w="120" w:type="dxa"/>
+              <w:bottom w:w="100" w:type="dxa"/>
+              <w:end w:w="120" w:type="dxa"/>
+            </w:tcMar>
+          </w:tcPr>
+          <w:p>
+            <w:pPr>
+              <w:spacing w:after="0"/>
+            </w:pPr>
+            <w:r>
+              <w:rPr>
+                <w:sz w:val="17"/>
+              </w:rPr>
+              <w:t>Không</w:t>
+            </w:r>
+          </w:p>
+        </w:tc>
+        <w:tc>
+          <w:tcPr>
+            <w:tcW w:type="dxa" w:w="1474"/>
+            <w:vAlign w:val="center"/>
+            <w:tcMar>
+              <w:top w:w="100" w:type="dxa"/>
+              <w:start w:w="120" w:type="dxa"/>
+              <w:bottom w:w="100" w:type="dxa"/>
+              <w:end w:w="120" w:type="dxa"/>
+            </w:tcMar>
+          </w:tcPr>
+          <w:p>
+            <w:pPr>
+              <w:spacing w:after="0"/>
+            </w:pPr>
+            <w:r>
+              <w:rPr>
+                <w:sz w:val="17"/>
+              </w:rPr>
+              <w:t>Không</w:t>
+            </w:r>
+          </w:p>
+        </w:tc>
+        <w:tc>
+          <w:tcPr>
+            <w:tcW w:type="dxa" w:w="1474"/>
+            <w:vAlign w:val="center"/>
+            <w:tcMar>
+              <w:top w:w="100" w:type="dxa"/>
+              <w:start w:w="120" w:type="dxa"/>
+              <w:bottom w:w="100" w:type="dxa"/>
+              <w:end w:w="120" w:type="dxa"/>
+            </w:tcMar>
+          </w:tcPr>
+          <w:p>
+            <w:pPr>
+              <w:spacing w:after="0"/>
+            </w:pPr>
+            <w:r>
+              <w:rPr>
+                <w:sz w:val="17"/>
+              </w:rPr>
+              <w:t>Có</w:t>
+            </w:r>
+          </w:p>
+        </w:tc>
+      </w:tr>
+      <w:tr>
+        <w:tc>
+          <w:tcPr>
+            <w:tcW w:type="dxa" w:w="3288"/>
+            <w:shd w:fill="EAF2F8"/>
+            <w:vAlign w:val="center"/>
+            <w:tcMar>
+              <w:top w:w="100" w:type="dxa"/>
+              <w:start w:w="120" w:type="dxa"/>
+              <w:bottom w:w="100" w:type="dxa"/>
+              <w:end w:w="120" w:type="dxa"/>
+            </w:tcMar>
+          </w:tcPr>
+          <w:p>
+            <w:pPr>
+              <w:spacing w:after="0"/>
+            </w:pPr>
+            <w:r>
+              <w:rPr>
+                <w:sz w:val="17"/>
+              </w:rPr>
+              <w:t>Dashboard và báo cáo tổng hợp</w:t>
+            </w:r>
+          </w:p>
+        </w:tc>
+        <w:tc>
+          <w:tcPr>
+            <w:tcW w:type="dxa" w:w="1247"/>
+            <w:shd w:fill="EAF2F8"/>
+            <w:vAlign w:val="center"/>
+            <w:tcMar>
+              <w:top w:w="100" w:type="dxa"/>
+              <w:start w:w="120" w:type="dxa"/>
+              <w:bottom w:w="100" w:type="dxa"/>
+              <w:end w:w="120" w:type="dxa"/>
+            </w:tcMar>
+          </w:tcPr>
+          <w:p>
+            <w:pPr>
+              <w:spacing w:after="0"/>
+            </w:pPr>
+            <w:r>
+              <w:rPr>
+                <w:sz w:val="17"/>
+              </w:rPr>
+              <w:t>Không</w:t>
+            </w:r>
+          </w:p>
+        </w:tc>
+        <w:tc>
+          <w:tcPr>
+            <w:tcW w:type="dxa" w:w="1474"/>
+            <w:shd w:fill="EAF2F8"/>
+            <w:vAlign w:val="center"/>
+            <w:tcMar>
+              <w:top w:w="100" w:type="dxa"/>
+              <w:start w:w="120" w:type="dxa"/>
+              <w:bottom w:w="100" w:type="dxa"/>
+              <w:end w:w="120" w:type="dxa"/>
+            </w:tcMar>
+          </w:tcPr>
+          <w:p>
+            <w:pPr>
+              <w:spacing w:after="0"/>
+            </w:pPr>
+            <w:r>
+              <w:rPr>
+                <w:sz w:val="17"/>
+              </w:rPr>
+              <w:t>Không</w:t>
+            </w:r>
+          </w:p>
+        </w:tc>
+        <w:tc>
+          <w:tcPr>
+            <w:tcW w:type="dxa" w:w="1474"/>
+            <w:shd w:fill="EAF2F8"/>
+            <w:vAlign w:val="center"/>
+            <w:tcMar>
+              <w:top w:w="100" w:type="dxa"/>
+              <w:start w:w="120" w:type="dxa"/>
+              <w:bottom w:w="100" w:type="dxa"/>
+              <w:end w:w="120" w:type="dxa"/>
+            </w:tcMar>
+          </w:tcPr>
+          <w:p>
+            <w:pPr>
+              <w:spacing w:after="0"/>
+            </w:pPr>
+            <w:r>
+              <w:rPr>
+                <w:sz w:val="17"/>
+              </w:rPr>
+              <w:t>Không</w:t>
+            </w:r>
+          </w:p>
+        </w:tc>
+        <w:tc>
+          <w:tcPr>
+            <w:tcW w:type="dxa" w:w="1474"/>
+            <w:shd w:fill="EAF2F8"/>
+            <w:vAlign w:val="center"/>
+            <w:tcMar>
+              <w:top w:w="100" w:type="dxa"/>
+              <w:start w:w="120" w:type="dxa"/>
+              <w:bottom w:w="100" w:type="dxa"/>
+              <w:end w:w="120" w:type="dxa"/>
+            </w:tcMar>
+          </w:tcPr>
+          <w:p>
+            <w:pPr>
+              <w:spacing w:after="0"/>
+            </w:pPr>
+            <w:r>
+              <w:rPr>
+                <w:sz w:val="17"/>
+              </w:rPr>
+              <w:t>Có</w:t>
+            </w:r>
+          </w:p>
+        </w:tc>
+      </w:tr>
+    </w:tbl>
+    <w:p>
+      <w:pPr>
+        <w:spacing w:after="0"/>
+      </w:pPr>
     </w:p>
     <w:p>
       <w:pPr>

</xml_diff>